<commit_message>
Revise thesis formatting to match Wuhan University of Technology spec
</commit_message>
<xml_diff>
--- a/paper/面向PCB金手指的测试尾板布点布线设计.docx
+++ b/paper/面向PCB金手指的测试尾板布点布线设计.docx
@@ -18,6 +18,7 @@
           <w:shd w:val="clear" w:fill="FFFFFF"/>
         </w:rPr>
       </w:pPr>
+      <w:bookmarkStart w:id="0" w:name="_GoBack"/>
       <w:r>
         <w:rPr>
           <w:rFonts w:hint="eastAsia" w:ascii="黑体" w:hAnsi="黑体" w:eastAsia="黑体" w:cs="黑体"/>
@@ -52,6 +53,7 @@
         </w:rPr>
       </w:pPr>
     </w:p>
+    <w:bookmarkEnd w:id="0"/>
     <w:p>
       <w:pPr>
         <w:rPr>
@@ -148,7 +150,271 @@
           <w:szCs w:val="24"/>
           <w:shd w:val="clear" w:fill="FFFFFF"/>
         </w:rPr>
-        <w:t>2.测试尾板的布点布线设计分为测试点插入和金手指到测试点的布线两个任务，基于以上两个任务分析面向PCB金手指的测试尾板布局布线的核心需求，包括需要布点的金手指类型、测试点插入位置的设定、测试点布线的最小间距等关键指标，明确约束条件；</w:t>
+        <w:t>2.测试尾板的布点布线设计分为</w:t>
+      </w:r>
+      <w:r>
+        <w:rPr>
+          <w:rFonts w:hint="eastAsia" w:ascii="黑体" w:hAnsi="黑体" w:eastAsia="黑体" w:cs="黑体"/>
+          <w:b w:val="0"/>
+          <w:bCs w:val="0"/>
+          <w:i w:val="0"/>
+          <w:iCs w:val="0"/>
+          <w:caps w:val="0"/>
+          <w:color w:val="auto"/>
+          <w:spacing w:val="0"/>
+          <w:sz w:val="24"/>
+          <w:szCs w:val="24"/>
+          <w:highlight w:val="yellow"/>
+          <w:shd w:val="clear" w:fill="FFFFFF"/>
+        </w:rPr>
+        <w:t>测试点插入</w:t>
+      </w:r>
+      <w:r>
+        <w:rPr>
+          <w:rFonts w:hint="eastAsia" w:ascii="黑体" w:hAnsi="黑体" w:eastAsia="黑体" w:cs="黑体"/>
+          <w:b w:val="0"/>
+          <w:bCs w:val="0"/>
+          <w:i w:val="0"/>
+          <w:iCs w:val="0"/>
+          <w:caps w:val="0"/>
+          <w:color w:val="auto"/>
+          <w:spacing w:val="0"/>
+          <w:sz w:val="24"/>
+          <w:szCs w:val="24"/>
+          <w:shd w:val="clear" w:fill="FFFFFF"/>
+        </w:rPr>
+        <w:t>和</w:t>
+      </w:r>
+      <w:r>
+        <w:rPr>
+          <w:rFonts w:hint="eastAsia" w:ascii="黑体" w:hAnsi="黑体" w:eastAsia="黑体" w:cs="黑体"/>
+          <w:b w:val="0"/>
+          <w:bCs w:val="0"/>
+          <w:i w:val="0"/>
+          <w:iCs w:val="0"/>
+          <w:caps w:val="0"/>
+          <w:color w:val="auto"/>
+          <w:spacing w:val="0"/>
+          <w:sz w:val="24"/>
+          <w:szCs w:val="24"/>
+          <w:highlight w:val="yellow"/>
+          <w:shd w:val="clear" w:fill="FFFFFF"/>
+        </w:rPr>
+        <w:t>金手指到测试点的布线</w:t>
+      </w:r>
+      <w:r>
+        <w:rPr>
+          <w:rFonts w:hint="eastAsia" w:ascii="黑体" w:hAnsi="黑体" w:eastAsia="黑体" w:cs="黑体"/>
+          <w:b w:val="0"/>
+          <w:bCs w:val="0"/>
+          <w:i w:val="0"/>
+          <w:iCs w:val="0"/>
+          <w:caps w:val="0"/>
+          <w:color w:val="auto"/>
+          <w:spacing w:val="0"/>
+          <w:sz w:val="24"/>
+          <w:szCs w:val="24"/>
+          <w:shd w:val="clear" w:fill="FFFFFF"/>
+        </w:rPr>
+        <w:t>两个任务，基于以上</w:t>
+      </w:r>
+      <w:r>
+        <w:rPr>
+          <w:rFonts w:hint="eastAsia" w:ascii="黑体" w:hAnsi="黑体" w:eastAsia="黑体" w:cs="黑体"/>
+          <w:b w:val="0"/>
+          <w:bCs w:val="0"/>
+          <w:i w:val="0"/>
+          <w:iCs w:val="0"/>
+          <w:caps w:val="0"/>
+          <w:color w:val="auto"/>
+          <w:spacing w:val="0"/>
+          <w:sz w:val="24"/>
+          <w:szCs w:val="24"/>
+          <w:highlight w:val="yellow"/>
+          <w:shd w:val="clear" w:fill="FFFFFF"/>
+        </w:rPr>
+        <w:t>两个任务分析</w:t>
+      </w:r>
+      <w:r>
+        <w:rPr>
+          <w:rFonts w:hint="eastAsia" w:ascii="黑体" w:hAnsi="黑体" w:eastAsia="黑体" w:cs="黑体"/>
+          <w:b w:val="0"/>
+          <w:bCs w:val="0"/>
+          <w:i w:val="0"/>
+          <w:iCs w:val="0"/>
+          <w:caps w:val="0"/>
+          <w:color w:val="auto"/>
+          <w:spacing w:val="0"/>
+          <w:sz w:val="24"/>
+          <w:szCs w:val="24"/>
+          <w:shd w:val="clear" w:fill="FFFFFF"/>
+        </w:rPr>
+        <w:t>面向PCB金手指的</w:t>
+      </w:r>
+      <w:r>
+        <w:rPr>
+          <w:rFonts w:hint="eastAsia" w:ascii="黑体" w:hAnsi="黑体" w:eastAsia="黑体" w:cs="黑体"/>
+          <w:b w:val="0"/>
+          <w:bCs w:val="0"/>
+          <w:i w:val="0"/>
+          <w:iCs w:val="0"/>
+          <w:caps w:val="0"/>
+          <w:color w:val="auto"/>
+          <w:spacing w:val="0"/>
+          <w:sz w:val="24"/>
+          <w:szCs w:val="24"/>
+          <w:highlight w:val="yellow"/>
+          <w:shd w:val="clear" w:fill="FFFFFF"/>
+        </w:rPr>
+        <w:t>测试尾板布局布线</w:t>
+      </w:r>
+      <w:r>
+        <w:rPr>
+          <w:rFonts w:hint="eastAsia" w:ascii="黑体" w:hAnsi="黑体" w:eastAsia="黑体" w:cs="黑体"/>
+          <w:b w:val="0"/>
+          <w:bCs w:val="0"/>
+          <w:i w:val="0"/>
+          <w:iCs w:val="0"/>
+          <w:caps w:val="0"/>
+          <w:color w:val="auto"/>
+          <w:spacing w:val="0"/>
+          <w:sz w:val="24"/>
+          <w:szCs w:val="24"/>
+          <w:shd w:val="clear" w:fill="FFFFFF"/>
+        </w:rPr>
+        <w:t>的核心需求，包括需要</w:t>
+      </w:r>
+      <w:r>
+        <w:rPr>
+          <w:rFonts w:hint="eastAsia" w:ascii="黑体" w:hAnsi="黑体" w:eastAsia="黑体" w:cs="黑体"/>
+          <w:b w:val="0"/>
+          <w:bCs w:val="0"/>
+          <w:i w:val="0"/>
+          <w:iCs w:val="0"/>
+          <w:caps w:val="0"/>
+          <w:color w:val="auto"/>
+          <w:spacing w:val="0"/>
+          <w:sz w:val="24"/>
+          <w:szCs w:val="24"/>
+          <w:highlight w:val="yellow"/>
+          <w:shd w:val="clear" w:fill="FFFFFF"/>
+        </w:rPr>
+        <w:t>布点的金手指类型</w:t>
+      </w:r>
+      <w:r>
+        <w:rPr>
+          <w:rFonts w:hint="eastAsia" w:ascii="黑体" w:hAnsi="黑体" w:eastAsia="黑体" w:cs="黑体"/>
+          <w:b w:val="0"/>
+          <w:bCs w:val="0"/>
+          <w:i w:val="0"/>
+          <w:iCs w:val="0"/>
+          <w:caps w:val="0"/>
+          <w:color w:val="auto"/>
+          <w:spacing w:val="0"/>
+          <w:sz w:val="24"/>
+          <w:szCs w:val="24"/>
+          <w:shd w:val="clear" w:fill="FFFFFF"/>
+        </w:rPr>
+        <w:t>、</w:t>
+      </w:r>
+      <w:r>
+        <w:rPr>
+          <w:rFonts w:hint="eastAsia" w:ascii="黑体" w:hAnsi="黑体" w:eastAsia="黑体" w:cs="黑体"/>
+          <w:b w:val="0"/>
+          <w:bCs w:val="0"/>
+          <w:i w:val="0"/>
+          <w:iCs w:val="0"/>
+          <w:caps w:val="0"/>
+          <w:color w:val="auto"/>
+          <w:spacing w:val="0"/>
+          <w:sz w:val="24"/>
+          <w:szCs w:val="24"/>
+          <w:highlight w:val="yellow"/>
+          <w:shd w:val="clear" w:fill="FFFFFF"/>
+        </w:rPr>
+        <w:t>测试点插入位置的设定</w:t>
+      </w:r>
+      <w:r>
+        <w:rPr>
+          <w:rFonts w:hint="eastAsia" w:ascii="黑体" w:hAnsi="黑体" w:eastAsia="黑体" w:cs="黑体"/>
+          <w:b w:val="0"/>
+          <w:bCs w:val="0"/>
+          <w:i w:val="0"/>
+          <w:iCs w:val="0"/>
+          <w:caps w:val="0"/>
+          <w:color w:val="auto"/>
+          <w:spacing w:val="0"/>
+          <w:sz w:val="24"/>
+          <w:szCs w:val="24"/>
+          <w:shd w:val="clear" w:fill="FFFFFF"/>
+        </w:rPr>
+        <w:t>、</w:t>
+      </w:r>
+      <w:r>
+        <w:rPr>
+          <w:rFonts w:hint="eastAsia" w:ascii="黑体" w:hAnsi="黑体" w:eastAsia="黑体" w:cs="黑体"/>
+          <w:b w:val="0"/>
+          <w:bCs w:val="0"/>
+          <w:i w:val="0"/>
+          <w:iCs w:val="0"/>
+          <w:caps w:val="0"/>
+          <w:color w:val="auto"/>
+          <w:spacing w:val="0"/>
+          <w:sz w:val="24"/>
+          <w:szCs w:val="24"/>
+          <w:highlight w:val="yellow"/>
+          <w:shd w:val="clear" w:fill="FFFFFF"/>
+        </w:rPr>
+        <w:t>测试点布线的最小间距</w:t>
+      </w:r>
+      <w:r>
+        <w:rPr>
+          <w:rFonts w:hint="eastAsia" w:ascii="黑体" w:hAnsi="黑体" w:eastAsia="黑体" w:cs="黑体"/>
+          <w:b w:val="0"/>
+          <w:bCs w:val="0"/>
+          <w:i w:val="0"/>
+          <w:iCs w:val="0"/>
+          <w:caps w:val="0"/>
+          <w:color w:val="auto"/>
+          <w:spacing w:val="0"/>
+          <w:sz w:val="24"/>
+          <w:szCs w:val="24"/>
+          <w:shd w:val="clear" w:fill="FFFFFF"/>
+        </w:rPr>
+        <w:t>等关键指标，</w:t>
+      </w:r>
+      <w:r>
+        <w:rPr>
+          <w:rFonts w:hint="eastAsia" w:ascii="黑体" w:hAnsi="黑体" w:eastAsia="黑体" w:cs="黑体"/>
+          <w:b w:val="0"/>
+          <w:bCs w:val="0"/>
+          <w:i w:val="0"/>
+          <w:iCs w:val="0"/>
+          <w:caps w:val="0"/>
+          <w:color w:val="auto"/>
+          <w:spacing w:val="0"/>
+          <w:sz w:val="24"/>
+          <w:szCs w:val="24"/>
+          <w:highlight w:val="yellow"/>
+          <w:shd w:val="clear" w:fill="FFFFFF"/>
+        </w:rPr>
+        <w:t>明确约束条件</w:t>
+      </w:r>
+      <w:r>
+        <w:rPr>
+          <w:rFonts w:hint="eastAsia" w:ascii="黑体" w:hAnsi="黑体" w:eastAsia="黑体" w:cs="黑体"/>
+          <w:b w:val="0"/>
+          <w:bCs w:val="0"/>
+          <w:i w:val="0"/>
+          <w:iCs w:val="0"/>
+          <w:caps w:val="0"/>
+          <w:color w:val="auto"/>
+          <w:spacing w:val="0"/>
+          <w:sz w:val="24"/>
+          <w:szCs w:val="24"/>
+          <w:shd w:val="clear" w:fill="FFFFFF"/>
+        </w:rPr>
+        <w:t>；</w:t>
       </w:r>
     </w:p>
     <w:p>
@@ -380,7 +646,106 @@
           <w:szCs w:val="24"/>
           <w:shd w:val="clear" w:fill="FFFFFF"/>
         </w:rPr>
-        <w:t>2.获取真实应用场景下的PCB金手指测试尾板设计案例，并确定布点布线约束；</w:t>
+        <w:t>2.</w:t>
+      </w:r>
+      <w:r>
+        <w:rPr>
+          <w:rFonts w:hint="eastAsia" w:ascii="黑体" w:hAnsi="黑体" w:eastAsia="黑体" w:cs="黑体"/>
+          <w:b w:val="0"/>
+          <w:bCs w:val="0"/>
+          <w:i w:val="0"/>
+          <w:iCs w:val="0"/>
+          <w:caps w:val="0"/>
+          <w:color w:val="auto"/>
+          <w:spacing w:val="0"/>
+          <w:sz w:val="24"/>
+          <w:szCs w:val="24"/>
+          <w:highlight w:val="yellow"/>
+          <w:shd w:val="clear" w:fill="FFFFFF"/>
+        </w:rPr>
+        <w:t>获取</w:t>
+      </w:r>
+      <w:r>
+        <w:rPr>
+          <w:rFonts w:hint="eastAsia" w:ascii="黑体" w:hAnsi="黑体" w:eastAsia="黑体" w:cs="黑体"/>
+          <w:b w:val="0"/>
+          <w:bCs w:val="0"/>
+          <w:i w:val="0"/>
+          <w:iCs w:val="0"/>
+          <w:caps w:val="0"/>
+          <w:color w:val="auto"/>
+          <w:spacing w:val="0"/>
+          <w:sz w:val="24"/>
+          <w:szCs w:val="24"/>
+          <w:shd w:val="clear" w:fill="FFFFFF"/>
+        </w:rPr>
+        <w:t>真实应用场景下的PCB</w:t>
+      </w:r>
+      <w:r>
+        <w:rPr>
+          <w:rFonts w:hint="eastAsia" w:ascii="黑体" w:hAnsi="黑体" w:eastAsia="黑体" w:cs="黑体"/>
+          <w:b w:val="0"/>
+          <w:bCs w:val="0"/>
+          <w:i w:val="0"/>
+          <w:iCs w:val="0"/>
+          <w:caps w:val="0"/>
+          <w:color w:val="auto"/>
+          <w:spacing w:val="0"/>
+          <w:sz w:val="24"/>
+          <w:szCs w:val="24"/>
+          <w:highlight w:val="yellow"/>
+          <w:shd w:val="clear" w:fill="FFFFFF"/>
+        </w:rPr>
+        <w:t>金手指测试尾板设计案例</w:t>
+      </w:r>
+      <w:r>
+        <w:rPr>
+          <w:rFonts w:hint="eastAsia" w:ascii="黑体" w:hAnsi="黑体" w:eastAsia="黑体" w:cs="黑体"/>
+          <w:b w:val="0"/>
+          <w:bCs w:val="0"/>
+          <w:i w:val="0"/>
+          <w:iCs w:val="0"/>
+          <w:caps w:val="0"/>
+          <w:color w:val="auto"/>
+          <w:spacing w:val="0"/>
+          <w:sz w:val="24"/>
+          <w:szCs w:val="24"/>
+          <w:shd w:val="clear" w:fill="FFFFFF"/>
+        </w:rPr>
+        <w:t>，并确定</w:t>
+      </w:r>
+      <w:r>
+        <w:rPr>
+          <w:rFonts w:hint="eastAsia" w:ascii="黑体" w:hAnsi="黑体" w:eastAsia="黑体" w:cs="黑体"/>
+          <w:b w:val="0"/>
+          <w:bCs w:val="0"/>
+          <w:i w:val="0"/>
+          <w:iCs w:val="0"/>
+          <w:caps w:val="0"/>
+          <w:color w:val="auto"/>
+          <w:spacing w:val="0"/>
+          <w:sz w:val="24"/>
+          <w:szCs w:val="24"/>
+          <w:highlight w:val="yellow"/>
+          <w:shd w:val="clear" w:fill="FFFFFF"/>
+        </w:rPr>
+        <w:t>布点布线约束</w:t>
+      </w:r>
+      <w:r>
+        <w:rPr>
+          <w:rFonts w:hint="eastAsia" w:ascii="黑体" w:hAnsi="黑体" w:eastAsia="黑体" w:cs="黑体"/>
+          <w:b w:val="0"/>
+          <w:bCs w:val="0"/>
+          <w:i w:val="0"/>
+          <w:iCs w:val="0"/>
+          <w:caps w:val="0"/>
+          <w:color w:val="auto"/>
+          <w:spacing w:val="0"/>
+          <w:sz w:val="24"/>
+          <w:szCs w:val="24"/>
+          <w:shd w:val="clear" w:fill="FFFFFF"/>
+        </w:rPr>
+        <w:t>；</w:t>
       </w:r>
     </w:p>
     <w:p>
@@ -446,7 +811,40 @@
           <w:szCs w:val="24"/>
           <w:shd w:val="clear" w:fill="FFFFFF"/>
         </w:rPr>
-        <w:t>5.开展对比实验，将所设计算法与人工布点布线在尾板面积、布通率、布点布线合法性等指标上进行量化对比；</w:t>
+        <w:t>5.</w:t>
+      </w:r>
+      <w:r>
+        <w:rPr>
+          <w:rFonts w:hint="eastAsia" w:ascii="黑体" w:hAnsi="黑体" w:eastAsia="黑体" w:cs="黑体"/>
+          <w:b w:val="0"/>
+          <w:bCs w:val="0"/>
+          <w:i w:val="0"/>
+          <w:iCs w:val="0"/>
+          <w:caps w:val="0"/>
+          <w:color w:val="auto"/>
+          <w:spacing w:val="0"/>
+          <w:sz w:val="24"/>
+          <w:szCs w:val="24"/>
+          <w:highlight w:val="yellow"/>
+          <w:shd w:val="clear" w:fill="FFFFFF"/>
+        </w:rPr>
+        <w:t>开展对比实验，将所设计算法与人工布点布线在尾板面积、布通率、布点布线合法性等指标上进行量化对比</w:t>
+      </w:r>
+      <w:r>
+        <w:rPr>
+          <w:rFonts w:hint="eastAsia" w:ascii="黑体" w:hAnsi="黑体" w:eastAsia="黑体" w:cs="黑体"/>
+          <w:b w:val="0"/>
+          <w:bCs w:val="0"/>
+          <w:i w:val="0"/>
+          <w:iCs w:val="0"/>
+          <w:caps w:val="0"/>
+          <w:color w:val="auto"/>
+          <w:spacing w:val="0"/>
+          <w:sz w:val="24"/>
+          <w:szCs w:val="24"/>
+          <w:shd w:val="clear" w:fill="FFFFFF"/>
+        </w:rPr>
+        <w:t>；</w:t>
       </w:r>
     </w:p>
     <w:p>
@@ -848,31 +1246,14 @@
           <w:szCs w:val="24"/>
           <w:shd w:val="clear" w:fill="FFFFFF"/>
         </w:rPr>
-        <w:t xml:space="preserve">Khalil E H, El-Mahlawy M H, Ibrahim F, et al. Design for testability </w:t>
-      </w:r>
-      <w:bookmarkStart w:id="0" w:name="_GoBack"/>
-      <w:bookmarkEnd w:id="0"/>
-      <w:r>
-        <w:rPr>
-          <w:rFonts w:hint="eastAsia" w:ascii="黑体" w:hAnsi="黑体" w:eastAsia="黑体" w:cs="黑体"/>
-          <w:b w:val="0"/>
-          <w:bCs w:val="0"/>
-          <w:i w:val="0"/>
-          <w:iCs w:val="0"/>
-          <w:caps w:val="0"/>
-          <w:color w:val="auto"/>
-          <w:spacing w:val="0"/>
-          <w:sz w:val="24"/>
-          <w:szCs w:val="24"/>
-          <w:shd w:val="clear" w:fill="FFFFFF"/>
-        </w:rPr>
-        <w:t>of circuits and Systems; An overview[C]//The International Conference on Electrical Engineering. Military Technical College, 2006, 5(5th International Conference on Electrical Engineering ICEENG 2006): 1-24.</w:t>
+        <w:t>Khalil E H, El-Mahlawy M H, Ibrahim F, et al. Design for testability of circuits and Systems; An overview[C]//The International Conference on Electrical Engineering. Military Technical College, 2006, 5(5th International Conference on Electrical Engineering ICEENG 2006): 1-24.</w:t>
       </w:r>
     </w:p>
     <w:p>
       <w:pPr>
         <w:widowControl w:val="0"/>
         <w:numPr>
+          <w:ilvl w:val="0"/>
           <w:numId w:val="0"/>
         </w:numPr>
         <w:jc w:val="both"/>
@@ -933,6 +1314,7 @@
       <w:pPr>
         <w:widowControl w:val="0"/>
         <w:numPr>
+          <w:ilvl w:val="0"/>
           <w:numId w:val="0"/>
         </w:numPr>
         <w:jc w:val="both"/>
@@ -993,6 +1375,7 @@
       <w:pPr>
         <w:widowControl w:val="0"/>
         <w:numPr>
+          <w:ilvl w:val="0"/>
           <w:numId w:val="0"/>
         </w:numPr>
         <w:jc w:val="both"/>

</xml_diff>

<commit_message>
Add EDA parsing experiments and thesis supplement
</commit_message>
<xml_diff>
--- a/paper/面向PCB金手指的测试尾板布点布线设计.docx
+++ b/paper/面向PCB金手指的测试尾板布点布线设计.docx
@@ -18,7 +18,6 @@
           <w:shd w:val="clear" w:fill="FFFFFF"/>
         </w:rPr>
       </w:pPr>
-      <w:bookmarkStart w:id="0" w:name="_GoBack"/>
       <w:r>
         <w:rPr>
           <w:rFonts w:hint="eastAsia" w:ascii="黑体" w:hAnsi="黑体" w:eastAsia="黑体" w:cs="黑体"/>
@@ -53,7 +52,6 @@
         </w:rPr>
       </w:pPr>
     </w:p>
-    <w:bookmarkEnd w:id="0"/>
     <w:p>
       <w:pPr>
         <w:rPr>
@@ -447,7 +445,42 @@
           <w:szCs w:val="24"/>
           <w:shd w:val="clear" w:fill="FFFFFF"/>
         </w:rPr>
-        <w:t>3.设计面向PCB金手指的测试尾板布点布线算法，包含算法框架、伪代码以及设计过程；</w:t>
+        <w:t>3.设计面向PCB金手指的测试尾板布点布线算法，包含</w:t>
+      </w:r>
+      <w:bookmarkStart w:id="0" w:name="_GoBack"/>
+      <w:r>
+        <w:rPr>
+          <w:rFonts w:hint="eastAsia" w:ascii="黑体" w:hAnsi="黑体" w:eastAsia="黑体" w:cs="黑体"/>
+          <w:b w:val="0"/>
+          <w:bCs w:val="0"/>
+          <w:i w:val="0"/>
+          <w:iCs w:val="0"/>
+          <w:caps w:val="0"/>
+          <w:color w:val="auto"/>
+          <w:spacing w:val="0"/>
+          <w:sz w:val="24"/>
+          <w:szCs w:val="24"/>
+          <w:highlight w:val="yellow"/>
+          <w:shd w:val="clear" w:fill="FFFFFF"/>
+        </w:rPr>
+        <w:t>算法框架、伪代码以及设计过程</w:t>
+      </w:r>
+      <w:bookmarkEnd w:id="0"/>
+      <w:r>
+        <w:rPr>
+          <w:rFonts w:hint="eastAsia" w:ascii="黑体" w:hAnsi="黑体" w:eastAsia="黑体" w:cs="黑体"/>
+          <w:b w:val="0"/>
+          <w:bCs w:val="0"/>
+          <w:i w:val="0"/>
+          <w:iCs w:val="0"/>
+          <w:caps w:val="0"/>
+          <w:color w:val="auto"/>
+          <w:spacing w:val="0"/>
+          <w:sz w:val="24"/>
+          <w:szCs w:val="24"/>
+          <w:shd w:val="clear" w:fill="FFFFFF"/>
+        </w:rPr>
+        <w:t>；</w:t>
       </w:r>
     </w:p>
     <w:p>

</xml_diff>